<commit_message>
docs: update domestic/foreign status section and add technical report docx
Co-authored-by: hongwenhao <215252686+hongwenhao@users.noreply.github.com>
</commit_message>
<xml_diff>
--- a/docs/毕业论文绪论.docx
+++ b/docs/毕业论文绪论.docx
@@ -199,10 +199,7 @@
         </w:rPr>
       </w:pPr>
       <w:r>
-        <w:rPr>
-          <w:lang w:eastAsia="zh-CN"/>
-        </w:rPr>
-        <w:t>国内方面，自如、贝壳、安居客等平台在房源聚合和线上签约方面积累了较为丰富的实践经验，但在信息披露层面仍有欠缺。张明远与赵雪梅（2024）研究指出，贝壳等平台对转租与中介代管情形缺乏有效标识，易引发租客误判[1]。李思涵（2023）通过实证调研发现，超过七成青年租客因水电计费方式不透明而产生额外支出[2]。在技术研究方面，高翔与杨帆（2023）提出融合协同过滤与内容相似度的混合推荐模型，在租房场景中取得了较好的匹配效果[4]；林俊杰（2022）探讨了Activiti流程引擎在O2O平台审批场景中的应用[6]；徐海涛（2024）设计了一套基于规则匹配的轻量级合同风控规则库，能够在不借助复杂NLP模型的前提下识别常见风险条款[3]。然而，上述研究大多聚焦于单一功能模块，尚未形成集房东身份透明化、费用标准化、智能推荐和合同风控于一体的完整方案。</w:t>
+        <w:t>国内研究主要关注平台功能完善与交易效率提升。自如、贝壳、安居客等在房源聚合、线上沟通和电子签约方面已较成熟，但关键信息披露仍不充分。已有研究指出，转租与中介代管房源缺少统一、醒目的身份标识，租客在浏览阶段难以判断交易对象性质，容易放大决策风险[1]。关于费用透明的调研也表明，水电等生活成本披露不足是青年租客投诉高发原因，计费规则不清会抬高实际租住支出[2]。技术层面，混合推荐模型在租房匹配中的有效性已被验证[4]，Activiti在审批自动化中的可行性也较明确[6]，基于规则库的轻量级合同风控方法可识别常见风险条款[3]。但现有成果多停留在推荐、流程或风控的单点优化，缺少面向业务闭环的一体化落地方案。</w:t>
       </w:r>
     </w:p>
     <w:p>
@@ -215,11 +212,7 @@
         </w:rPr>
       </w:pPr>
       <w:r>
-        <w:rPr>
-          <w:lang w:eastAsia="zh-CN"/>
-        </w:rPr>
-        <w:lastRenderedPageBreak/>
-        <w:t>国外方面，Zillow、Airbnb、ImmobilienScout24等平台在房源推荐和信用体系建设方面走在前列。Chen等（2023）在Zillow平台上引入图神经网络对用户与房源关系进行建模，推荐准确率得到显著提升[16]。Müller与Schmidt（2024）开发了基于规则引擎的租赁合同审查工具，可自动标记押金过高、维修责任缺失等不公平条款，并在柏林进行了试点[17]。Tan等（2023）提出的可信房东认证体系通过对接政府产权数据库验证房东身份，使欺诈风险下降了41%[18]。不过，这些方案多依赖较高成本的基础设施（如政府数据接口、大规模算力），在国内现有条件下直接移植存在适配性困难。总体而言，当前国内外在信息透明机制与智能服务手段的深度融合方面仍有较大的探索空间。</w:t>
+        <w:t>国外平台更强调“算法能力+制度约束”的协同建设。Zillow、Airbnb、ImmobilienScout24等在用户画像、信用评价和交互体验方面积累较深。相关研究显示，引入图神经网络后，用户—房源关系建模精度和推荐效果可明显提升[16]；基于规则引擎的合同审查工具能够自动识别押金过高、维修责任缺失等不公平条款，并已在城市试点中取得成效[17]；通过对接权属数据库开展房东真实性核验，也被证明可降低欺诈风险[18]。同时，欧盟数字服务法案对平台主体标识提出更明确要求，为信息披露提供了制度支撑[8]。不过，这类方案通常依赖高质量公共数据接口、完善信用基础设施和较高算力投入，直接移植到国内场景成本较高。总体看，如何在本土技术与监管条件下实现“身份透明、费用透明、推荐智能、合同风控前置”的系统化融合，仍是本课题需要解决的关键问题。</w:t>
       </w:r>
     </w:p>
     <w:p>

</xml_diff>